<commit_message>
Fill in personal details and point links to the zheng1 repository
</commit_message>
<xml_diff>
--- a/docs/resume.docx
+++ b/docs/resume.docx
@@ -13,7 +13,7 @@
           <w:color w:val="1F2333"/>
           <w:sz w:val="44"/>
         </w:rPr>
-        <w:t>[你的姓名]</w:t>
+        <w:t>KeingZheng</w:t>
       </w:r>
     </w:p>
     <w:p>
@@ -41,7 +41,7 @@
           <w:color w:val="5B6178"/>
           <w:sz w:val="18"/>
         </w:rPr>
-        <w:t>福建农林大学　|　邮箱：your@email.com　|　GitHub：github.com/[你的用户名]</w:t>
+        <w:t>福建农林大学　|　邮箱：2776599149@qq.com　|　GitHub：github.com/Keing-Z</w:t>
       </w:r>
     </w:p>
     <w:p>
@@ -603,7 +603,7 @@
           <w:color w:val="5B6178"/>
           <w:sz w:val="18"/>
         </w:rPr>
-        <w:t>项目源代码与详细文档见 GitHub 仓库：[链接]。各项目 README 均完整记录了设计取舍、技术权衡与已知限制。</w:t>
+        <w:t>项目源代码与详细文档见 GitHub 仓库：github.com/Keing-Z/zheng1。各项目 README 均完整记录了设计取舍、技术权衡与已知限制。</w:t>
       </w:r>
     </w:p>
     <w:sectPr>

</xml_diff>